<commit_message>
Comments Table Added + Deleting Animation for Cities
</commit_message>
<xml_diff>
--- a/Assignment/Assignment.docx
+++ b/Assignment/Assignment.docx
@@ -554,23 +554,13 @@
           <w:szCs w:val="18"/>
         </w:rPr>
       </w:pPr>
-      <w:proofErr w:type="spellStart"/>
-      <w:r>
-        <w:rPr>
-          <w:sz w:val="18"/>
-          <w:szCs w:val="18"/>
-          <w:highlight w:val="green"/>
-        </w:rPr>
-        <w:t>localeStorage</w:t>
-      </w:r>
-      <w:proofErr w:type="spellEnd"/>
-      <w:r>
-        <w:rPr>
-          <w:sz w:val="18"/>
-          <w:szCs w:val="18"/>
-          <w:highlight w:val="green"/>
-        </w:rPr>
-        <w:t xml:space="preserve"> for </w:t>
+      <w:r>
+        <w:rPr>
+          <w:sz w:val="18"/>
+          <w:szCs w:val="18"/>
+          <w:highlight w:val="green"/>
+        </w:rPr>
+        <w:t xml:space="preserve">localeStorage for </w:t>
       </w:r>
       <w:r>
         <w:rPr>
@@ -1152,6 +1142,7 @@
           <w:bCs/>
           <w:sz w:val="18"/>
           <w:szCs w:val="18"/>
+          <w:highlight w:val="green"/>
           <w:u w:val="single"/>
         </w:rPr>
       </w:pPr>
@@ -1159,44 +1150,18 @@
         <w:rPr>
           <w:sz w:val="18"/>
           <w:szCs w:val="18"/>
-        </w:rPr>
-        <w:t>Back up data</w:t>
-      </w:r>
-      <w:r>
-        <w:rPr>
-          <w:sz w:val="18"/>
-          <w:szCs w:val="18"/>
-        </w:rPr>
-        <w:t xml:space="preserve"> (Should be okay leave </w:t>
-      </w:r>
-      <w:proofErr w:type="spellStart"/>
-      <w:r>
-        <w:rPr>
-          <w:sz w:val="18"/>
-          <w:szCs w:val="18"/>
-        </w:rPr>
-        <w:t>til</w:t>
-      </w:r>
-      <w:proofErr w:type="spellEnd"/>
-      <w:r>
-        <w:rPr>
-          <w:sz w:val="18"/>
-          <w:szCs w:val="18"/>
-        </w:rPr>
-        <w:t xml:space="preserve"> the end)</w:t>
-      </w:r>
-    </w:p>
-    <w:p>
-      <w:pPr>
-        <w:pStyle w:val="ListParagraph"/>
-        <w:rPr>
-          <w:b/>
-          <w:bCs/>
-          <w:sz w:val="18"/>
-          <w:szCs w:val="18"/>
-          <w:u w:val="single"/>
-        </w:rPr>
-      </w:pPr>
+          <w:highlight w:val="green"/>
+        </w:rPr>
+        <w:t xml:space="preserve">Animated </w:t>
+      </w:r>
+      <w:r>
+        <w:rPr>
+          <w:sz w:val="18"/>
+          <w:szCs w:val="18"/>
+          <w:highlight w:val="green"/>
+        </w:rPr>
+        <w:t>Deletion of Cards</w:t>
+      </w:r>
     </w:p>
     <w:p>
       <w:pPr>
@@ -1211,7 +1176,6 @@
           <w:bCs/>
           <w:sz w:val="18"/>
           <w:szCs w:val="18"/>
-          <w:highlight w:val="green"/>
           <w:u w:val="single"/>
         </w:rPr>
       </w:pPr>
@@ -1219,18 +1183,28 @@
         <w:rPr>
           <w:sz w:val="18"/>
           <w:szCs w:val="18"/>
-          <w:highlight w:val="green"/>
-        </w:rPr>
-        <w:t>Give context to website</w:t>
-      </w:r>
-      <w:r>
-        <w:rPr>
-          <w:sz w:val="18"/>
-          <w:szCs w:val="18"/>
-          <w:highlight w:val="green"/>
-        </w:rPr>
-        <w:t xml:space="preserve"> (Should be easy HTML)</w:t>
-      </w:r>
+        </w:rPr>
+        <w:t>Back up data</w:t>
+      </w:r>
+      <w:r>
+        <w:rPr>
+          <w:sz w:val="18"/>
+          <w:szCs w:val="18"/>
+        </w:rPr>
+        <w:t xml:space="preserve"> (Should be okay leave til the end)</w:t>
+      </w:r>
+    </w:p>
+    <w:p>
+      <w:pPr>
+        <w:pStyle w:val="ListParagraph"/>
+        <w:rPr>
+          <w:b/>
+          <w:bCs/>
+          <w:sz w:val="18"/>
+          <w:szCs w:val="18"/>
+          <w:u w:val="single"/>
+        </w:rPr>
+      </w:pPr>
     </w:p>
     <w:p>
       <w:pPr>
@@ -1255,15 +1229,15 @@
           <w:szCs w:val="18"/>
           <w:highlight w:val="green"/>
         </w:rPr>
-        <w:t xml:space="preserve">Carousel with </w:t>
-      </w:r>
-      <w:r>
-        <w:rPr>
-          <w:sz w:val="18"/>
-          <w:szCs w:val="18"/>
-          <w:highlight w:val="green"/>
-        </w:rPr>
-        <w:t>Transitions</w:t>
+        <w:t>Give context to website</w:t>
+      </w:r>
+      <w:r>
+        <w:rPr>
+          <w:sz w:val="18"/>
+          <w:szCs w:val="18"/>
+          <w:highlight w:val="green"/>
+        </w:rPr>
+        <w:t xml:space="preserve"> (Should be easy HTML)</w:t>
       </w:r>
     </w:p>
     <w:p>
@@ -1279,6 +1253,7 @@
           <w:bCs/>
           <w:sz w:val="18"/>
           <w:szCs w:val="18"/>
+          <w:highlight w:val="green"/>
           <w:u w:val="single"/>
         </w:rPr>
       </w:pPr>
@@ -1286,6 +1261,41 @@
         <w:rPr>
           <w:sz w:val="18"/>
           <w:szCs w:val="18"/>
+          <w:highlight w:val="green"/>
+        </w:rPr>
+        <w:t xml:space="preserve">Carousel with </w:t>
+      </w:r>
+      <w:r>
+        <w:rPr>
+          <w:sz w:val="18"/>
+          <w:szCs w:val="18"/>
+          <w:highlight w:val="green"/>
+        </w:rPr>
+        <w:t>Transitions</w:t>
+      </w:r>
+    </w:p>
+    <w:p>
+      <w:pPr>
+        <w:pStyle w:val="ListParagraph"/>
+        <w:numPr>
+          <w:ilvl w:val="0"/>
+          <w:numId w:val="3"/>
+        </w:numPr>
+        <w:jc w:val="center"/>
+        <w:rPr>
+          <w:b/>
+          <w:bCs/>
+          <w:sz w:val="18"/>
+          <w:szCs w:val="18"/>
+          <w:highlight w:val="green"/>
+          <w:u w:val="single"/>
+        </w:rPr>
+      </w:pPr>
+      <w:r>
+        <w:rPr>
+          <w:sz w:val="18"/>
+          <w:szCs w:val="18"/>
+          <w:highlight w:val="green"/>
         </w:rPr>
         <w:t xml:space="preserve">Have a form </w:t>
       </w:r>
@@ -1293,6 +1303,7 @@
         <w:rPr>
           <w:sz w:val="18"/>
           <w:szCs w:val="18"/>
+          <w:highlight w:val="green"/>
         </w:rPr>
         <w:t>for comments, display them in a table</w:t>
       </w:r>
@@ -1300,6 +1311,7 @@
         <w:rPr>
           <w:sz w:val="18"/>
           <w:szCs w:val="18"/>
+          <w:highlight w:val="green"/>
         </w:rPr>
         <w:t xml:space="preserve"> (Tough, important)</w:t>
       </w:r>

</xml_diff>

<commit_message>
Week 11 Labs Complete, Image Event Changed
</commit_message>
<xml_diff>
--- a/Assignment/Assignment.docx
+++ b/Assignment/Assignment.docx
@@ -1,6 +1,6 @@
 
 <file path=word/document.xml><?xml version="1.0" encoding="utf-8"?>
-<w:document xmlns:wpc="http://schemas.microsoft.com/office/word/2010/wordprocessingCanvas" xmlns:cx="http://schemas.microsoft.com/office/drawing/2014/chartex" xmlns:cx1="http://schemas.microsoft.com/office/drawing/2015/9/8/chartex" xmlns:cx2="http://schemas.microsoft.com/office/drawing/2015/10/21/chartex" xmlns:cx3="http://schemas.microsoft.com/office/drawing/2016/5/9/chartex" xmlns:cx4="http://schemas.microsoft.com/office/drawing/2016/5/10/chartex" xmlns:cx5="http://schemas.microsoft.com/office/drawing/2016/5/11/chartex" xmlns:cx6="http://schemas.microsoft.com/office/drawing/2016/5/12/chartex" xmlns:cx7="http://schemas.microsoft.com/office/drawing/2016/5/13/chartex" xmlns:cx8="http://schemas.microsoft.com/office/drawing/2016/5/14/chartex" xmlns:mc="http://schemas.openxmlformats.org/markup-compatibility/2006" xmlns:aink="http://schemas.microsoft.com/office/drawing/2016/ink" xmlns:am3d="http://schemas.microsoft.com/office/drawing/2017/model3d" xmlns:o="urn:schemas-microsoft-com:office:office" xmlns:oel="http://schemas.microsoft.com/office/2019/extlst" xmlns:r="http://schemas.openxmlformats.org/officeDocument/2006/relationships" xmlns:m="http://schemas.openxmlformats.org/officeDocument/2006/math" xmlns:v="urn:schemas-microsoft-com:vml" xmlns:wp14="http://schemas.microsoft.com/office/word/2010/wordprocessingDrawing" xmlns:wp="http://schemas.openxmlformats.org/drawingml/2006/wordprocessingDrawing" xmlns:w10="urn:schemas-microsoft-com:office:word" xmlns:w="http://schemas.openxmlformats.org/wordprocessingml/2006/main" xmlns:w14="http://schemas.microsoft.com/office/word/2010/wordml" xmlns:w15="http://schemas.microsoft.com/office/word/2012/wordml" xmlns:w16cex="http://schemas.microsoft.com/office/word/2018/wordml/cex" xmlns:w16cid="http://schemas.microsoft.com/office/word/2016/wordml/cid" xmlns:w16="http://schemas.microsoft.com/office/word/2018/wordml" xmlns:w16du="http://schemas.microsoft.com/office/word/2023/wordml/word16du" xmlns:w16sdtdh="http://schemas.microsoft.com/office/word/2020/wordml/sdtdatahash" xmlns:w16sdtfl="http://schemas.microsoft.com/office/word/2024/wordml/sdtformatlock" xmlns:w16se="http://schemas.microsoft.com/office/word/2015/wordml/symex" xmlns:wpg="http://schemas.microsoft.com/office/word/2010/wordprocessingGroup" xmlns:wpi="http://schemas.microsoft.com/office/word/2010/wordprocessingInk" xmlns:wne="http://schemas.microsoft.com/office/word/2006/wordml" xmlns:wps="http://schemas.microsoft.com/office/word/2010/wordprocessingShape" mc:Ignorable="w14 w15 w16se w16cid w16 w16cex w16sdtdh w16sdtfl w16du wp14">
+<w:document xmlns:wpc="http://schemas.microsoft.com/office/word/2010/wordprocessingCanvas" xmlns:cx="http://schemas.microsoft.com/office/drawing/2014/chartex" xmlns:cx1="http://schemas.microsoft.com/office/drawing/2015/9/8/chartex" xmlns:cx2="http://schemas.microsoft.com/office/drawing/2015/10/21/chartex" xmlns:cx3="http://schemas.microsoft.com/office/drawing/2016/5/9/chartex" xmlns:cx4="http://schemas.microsoft.com/office/drawing/2016/5/10/chartex" xmlns:cx5="http://schemas.microsoft.com/office/drawing/2016/5/11/chartex" xmlns:cx6="http://schemas.microsoft.com/office/drawing/2016/5/12/chartex" xmlns:cx7="http://schemas.microsoft.com/office/drawing/2016/5/13/chartex" xmlns:cx8="http://schemas.microsoft.com/office/drawing/2016/5/14/chartex" xmlns:mc="http://schemas.openxmlformats.org/markup-compatibility/2006" xmlns:aink="http://schemas.microsoft.com/office/drawing/2016/ink" xmlns:am3d="http://schemas.microsoft.com/office/drawing/2017/model3d" xmlns:o="urn:schemas-microsoft-com:office:office" xmlns:r="http://schemas.openxmlformats.org/officeDocument/2006/relationships" xmlns:m="http://schemas.openxmlformats.org/officeDocument/2006/math" xmlns:v="urn:schemas-microsoft-com:vml" xmlns:wp14="http://schemas.microsoft.com/office/word/2010/wordprocessingDrawing" xmlns:wp="http://schemas.openxmlformats.org/drawingml/2006/wordprocessingDrawing" xmlns:w10="urn:schemas-microsoft-com:office:word" xmlns:w="http://schemas.openxmlformats.org/wordprocessingml/2006/main" xmlns:w14="http://schemas.microsoft.com/office/word/2010/wordml" xmlns:w15="http://schemas.microsoft.com/office/word/2012/wordml" xmlns:w16cex="http://schemas.microsoft.com/office/word/2018/wordml/cex" xmlns:w16cid="http://schemas.microsoft.com/office/word/2016/wordml/cid" xmlns:w16="http://schemas.microsoft.com/office/word/2018/wordml" xmlns:w16sdtdh="http://schemas.microsoft.com/office/word/2020/wordml/sdtdatahash" xmlns:w16se="http://schemas.microsoft.com/office/word/2015/wordml/symex" xmlns:wpg="http://schemas.microsoft.com/office/word/2010/wordprocessingGroup" xmlns:wpi="http://schemas.microsoft.com/office/word/2010/wordprocessingInk" xmlns:wne="http://schemas.microsoft.com/office/word/2006/wordml" xmlns:wps="http://schemas.microsoft.com/office/word/2010/wordprocessingShape" mc:Ignorable="w14 w15 w16se w16cid w16 w16cex w16sdtdh wp14">
   <w:body>
     <w:p>
       <w:pPr>
@@ -554,13 +554,23 @@
           <w:szCs w:val="18"/>
         </w:rPr>
       </w:pPr>
-      <w:r>
-        <w:rPr>
-          <w:sz w:val="18"/>
-          <w:szCs w:val="18"/>
-          <w:highlight w:val="green"/>
-        </w:rPr>
-        <w:t xml:space="preserve">localeStorage for </w:t>
+      <w:proofErr w:type="spellStart"/>
+      <w:r>
+        <w:rPr>
+          <w:sz w:val="18"/>
+          <w:szCs w:val="18"/>
+          <w:highlight w:val="green"/>
+        </w:rPr>
+        <w:t>localeStorage</w:t>
+      </w:r>
+      <w:proofErr w:type="spellEnd"/>
+      <w:r>
+        <w:rPr>
+          <w:sz w:val="18"/>
+          <w:szCs w:val="18"/>
+          <w:highlight w:val="green"/>
+        </w:rPr>
+        <w:t xml:space="preserve"> for </w:t>
       </w:r>
       <w:r>
         <w:rPr>
@@ -669,7 +679,23 @@
           <w:sz w:val="18"/>
           <w:szCs w:val="18"/>
         </w:rPr>
-        <w:t>Try show off another feature if possible</w:t>
+        <w:t xml:space="preserve">Try show off another </w:t>
+      </w:r>
+      <w:proofErr w:type="gramStart"/>
+      <w:r>
+        <w:rPr>
+          <w:sz w:val="18"/>
+          <w:szCs w:val="18"/>
+        </w:rPr>
+        <w:t>feature</w:t>
+      </w:r>
+      <w:proofErr w:type="gramEnd"/>
+      <w:r>
+        <w:rPr>
+          <w:sz w:val="18"/>
+          <w:szCs w:val="18"/>
+        </w:rPr>
+        <w:t xml:space="preserve"> if possible</w:t>
       </w:r>
       <w:r>
         <w:rPr>
@@ -1319,18 +1345,6 @@
     <w:p>
       <w:pPr>
         <w:pStyle w:val="ListParagraph"/>
-        <w:rPr>
-          <w:b/>
-          <w:bCs/>
-          <w:sz w:val="18"/>
-          <w:szCs w:val="18"/>
-          <w:u w:val="single"/>
-        </w:rPr>
-      </w:pPr>
-    </w:p>
-    <w:p>
-      <w:pPr>
-        <w:pStyle w:val="ListParagraph"/>
         <w:numPr>
           <w:ilvl w:val="0"/>
           <w:numId w:val="3"/>
@@ -1349,15 +1363,63 @@
           <w:sz w:val="18"/>
           <w:szCs w:val="18"/>
         </w:rPr>
-        <w:t>Add a plugin</w:t>
-      </w:r>
-      <w:r>
-        <w:rPr>
-          <w:sz w:val="18"/>
-          <w:szCs w:val="18"/>
-        </w:rPr>
-        <w:t xml:space="preserve"> (Very end)</w:t>
-      </w:r>
+        <w:t xml:space="preserve">Make new comments push to start </w:t>
+      </w:r>
+    </w:p>
+    <w:p>
+      <w:pPr>
+        <w:pStyle w:val="ListParagraph"/>
+        <w:numPr>
+          <w:ilvl w:val="0"/>
+          <w:numId w:val="3"/>
+        </w:numPr>
+        <w:jc w:val="center"/>
+        <w:rPr>
+          <w:b/>
+          <w:bCs/>
+          <w:sz w:val="18"/>
+          <w:szCs w:val="18"/>
+          <w:u w:val="single"/>
+        </w:rPr>
+      </w:pPr>
+      <w:r>
+        <w:rPr>
+          <w:sz w:val="18"/>
+          <w:szCs w:val="18"/>
+        </w:rPr>
+        <w:t>Add a</w:t>
+      </w:r>
+      <w:r>
+        <w:rPr>
+          <w:sz w:val="18"/>
+          <w:szCs w:val="18"/>
+        </w:rPr>
+        <w:t>n easy plugin</w:t>
+      </w:r>
+    </w:p>
+    <w:p>
+      <w:pPr>
+        <w:pStyle w:val="ListParagraph"/>
+        <w:rPr>
+          <w:b/>
+          <w:bCs/>
+          <w:sz w:val="18"/>
+          <w:szCs w:val="18"/>
+          <w:u w:val="single"/>
+        </w:rPr>
+      </w:pPr>
+    </w:p>
+    <w:p>
+      <w:pPr>
+        <w:pStyle w:val="ListParagraph"/>
+        <w:rPr>
+          <w:b/>
+          <w:bCs/>
+          <w:sz w:val="18"/>
+          <w:szCs w:val="18"/>
+          <w:u w:val="single"/>
+        </w:rPr>
+      </w:pPr>
     </w:p>
     <w:p>
       <w:pPr>
@@ -1450,7 +1512,7 @@
 </file>
 
 <file path=word/endnotes.xml><?xml version="1.0" encoding="utf-8"?>
-<w:endnotes xmlns:wpc="http://schemas.microsoft.com/office/word/2010/wordprocessingCanvas" xmlns:cx="http://schemas.microsoft.com/office/drawing/2014/chartex" xmlns:cx1="http://schemas.microsoft.com/office/drawing/2015/9/8/chartex" xmlns:cx2="http://schemas.microsoft.com/office/drawing/2015/10/21/chartex" xmlns:cx3="http://schemas.microsoft.com/office/drawing/2016/5/9/chartex" xmlns:cx4="http://schemas.microsoft.com/office/drawing/2016/5/10/chartex" xmlns:cx5="http://schemas.microsoft.com/office/drawing/2016/5/11/chartex" xmlns:cx6="http://schemas.microsoft.com/office/drawing/2016/5/12/chartex" xmlns:cx7="http://schemas.microsoft.com/office/drawing/2016/5/13/chartex" xmlns:cx8="http://schemas.microsoft.com/office/drawing/2016/5/14/chartex" xmlns:mc="http://schemas.openxmlformats.org/markup-compatibility/2006" xmlns:aink="http://schemas.microsoft.com/office/drawing/2016/ink" xmlns:am3d="http://schemas.microsoft.com/office/drawing/2017/model3d" xmlns:o="urn:schemas-microsoft-com:office:office" xmlns:oel="http://schemas.microsoft.com/office/2019/extlst" xmlns:r="http://schemas.openxmlformats.org/officeDocument/2006/relationships" xmlns:m="http://schemas.openxmlformats.org/officeDocument/2006/math" xmlns:v="urn:schemas-microsoft-com:vml" xmlns:wp14="http://schemas.microsoft.com/office/word/2010/wordprocessingDrawing" xmlns:wp="http://schemas.openxmlformats.org/drawingml/2006/wordprocessingDrawing" xmlns:w10="urn:schemas-microsoft-com:office:word" xmlns:w="http://schemas.openxmlformats.org/wordprocessingml/2006/main" xmlns:w14="http://schemas.microsoft.com/office/word/2010/wordml" xmlns:w15="http://schemas.microsoft.com/office/word/2012/wordml" xmlns:w16cex="http://schemas.microsoft.com/office/word/2018/wordml/cex" xmlns:w16cid="http://schemas.microsoft.com/office/word/2016/wordml/cid" xmlns:w16="http://schemas.microsoft.com/office/word/2018/wordml" xmlns:w16du="http://schemas.microsoft.com/office/word/2023/wordml/word16du" xmlns:w16sdtdh="http://schemas.microsoft.com/office/word/2020/wordml/sdtdatahash" xmlns:w16sdtfl="http://schemas.microsoft.com/office/word/2024/wordml/sdtformatlock" xmlns:w16se="http://schemas.microsoft.com/office/word/2015/wordml/symex" xmlns:wpg="http://schemas.microsoft.com/office/word/2010/wordprocessingGroup" xmlns:wpi="http://schemas.microsoft.com/office/word/2010/wordprocessingInk" xmlns:wne="http://schemas.microsoft.com/office/word/2006/wordml" xmlns:wps="http://schemas.microsoft.com/office/word/2010/wordprocessingShape" mc:Ignorable="w14 w15 w16se w16cid w16 w16cex w16sdtdh w16sdtfl w16du wp14">
+<w:endnotes xmlns:wpc="http://schemas.microsoft.com/office/word/2010/wordprocessingCanvas" xmlns:cx="http://schemas.microsoft.com/office/drawing/2014/chartex" xmlns:cx1="http://schemas.microsoft.com/office/drawing/2015/9/8/chartex" xmlns:cx2="http://schemas.microsoft.com/office/drawing/2015/10/21/chartex" xmlns:cx3="http://schemas.microsoft.com/office/drawing/2016/5/9/chartex" xmlns:cx4="http://schemas.microsoft.com/office/drawing/2016/5/10/chartex" xmlns:cx5="http://schemas.microsoft.com/office/drawing/2016/5/11/chartex" xmlns:cx6="http://schemas.microsoft.com/office/drawing/2016/5/12/chartex" xmlns:cx7="http://schemas.microsoft.com/office/drawing/2016/5/13/chartex" xmlns:cx8="http://schemas.microsoft.com/office/drawing/2016/5/14/chartex" xmlns:mc="http://schemas.openxmlformats.org/markup-compatibility/2006" xmlns:aink="http://schemas.microsoft.com/office/drawing/2016/ink" xmlns:am3d="http://schemas.microsoft.com/office/drawing/2017/model3d" xmlns:o="urn:schemas-microsoft-com:office:office" xmlns:r="http://schemas.openxmlformats.org/officeDocument/2006/relationships" xmlns:m="http://schemas.openxmlformats.org/officeDocument/2006/math" xmlns:v="urn:schemas-microsoft-com:vml" xmlns:wp14="http://schemas.microsoft.com/office/word/2010/wordprocessingDrawing" xmlns:wp="http://schemas.openxmlformats.org/drawingml/2006/wordprocessingDrawing" xmlns:w10="urn:schemas-microsoft-com:office:word" xmlns:w="http://schemas.openxmlformats.org/wordprocessingml/2006/main" xmlns:w14="http://schemas.microsoft.com/office/word/2010/wordml" xmlns:w15="http://schemas.microsoft.com/office/word/2012/wordml" xmlns:w16cex="http://schemas.microsoft.com/office/word/2018/wordml/cex" xmlns:w16cid="http://schemas.microsoft.com/office/word/2016/wordml/cid" xmlns:w16="http://schemas.microsoft.com/office/word/2018/wordml" xmlns:w16sdtdh="http://schemas.microsoft.com/office/word/2020/wordml/sdtdatahash" xmlns:w16se="http://schemas.microsoft.com/office/word/2015/wordml/symex" xmlns:wpg="http://schemas.microsoft.com/office/word/2010/wordprocessingGroup" xmlns:wpi="http://schemas.microsoft.com/office/word/2010/wordprocessingInk" xmlns:wne="http://schemas.microsoft.com/office/word/2006/wordml" xmlns:wps="http://schemas.microsoft.com/office/word/2010/wordprocessingShape" mc:Ignorable="w14 w15 w16se w16cid w16 w16cex w16sdtdh wp14">
   <w:endnote w:type="separator" w:id="-1">
     <w:p>
       <w:pPr>
@@ -1475,7 +1537,7 @@
 </file>
 
 <file path=word/footnotes.xml><?xml version="1.0" encoding="utf-8"?>
-<w:footnotes xmlns:wpc="http://schemas.microsoft.com/office/word/2010/wordprocessingCanvas" xmlns:cx="http://schemas.microsoft.com/office/drawing/2014/chartex" xmlns:cx1="http://schemas.microsoft.com/office/drawing/2015/9/8/chartex" xmlns:cx2="http://schemas.microsoft.com/office/drawing/2015/10/21/chartex" xmlns:cx3="http://schemas.microsoft.com/office/drawing/2016/5/9/chartex" xmlns:cx4="http://schemas.microsoft.com/office/drawing/2016/5/10/chartex" xmlns:cx5="http://schemas.microsoft.com/office/drawing/2016/5/11/chartex" xmlns:cx6="http://schemas.microsoft.com/office/drawing/2016/5/12/chartex" xmlns:cx7="http://schemas.microsoft.com/office/drawing/2016/5/13/chartex" xmlns:cx8="http://schemas.microsoft.com/office/drawing/2016/5/14/chartex" xmlns:mc="http://schemas.openxmlformats.org/markup-compatibility/2006" xmlns:aink="http://schemas.microsoft.com/office/drawing/2016/ink" xmlns:am3d="http://schemas.microsoft.com/office/drawing/2017/model3d" xmlns:o="urn:schemas-microsoft-com:office:office" xmlns:oel="http://schemas.microsoft.com/office/2019/extlst" xmlns:r="http://schemas.openxmlformats.org/officeDocument/2006/relationships" xmlns:m="http://schemas.openxmlformats.org/officeDocument/2006/math" xmlns:v="urn:schemas-microsoft-com:vml" xmlns:wp14="http://schemas.microsoft.com/office/word/2010/wordprocessingDrawing" xmlns:wp="http://schemas.openxmlformats.org/drawingml/2006/wordprocessingDrawing" xmlns:w10="urn:schemas-microsoft-com:office:word" xmlns:w="http://schemas.openxmlformats.org/wordprocessingml/2006/main" xmlns:w14="http://schemas.microsoft.com/office/word/2010/wordml" xmlns:w15="http://schemas.microsoft.com/office/word/2012/wordml" xmlns:w16cex="http://schemas.microsoft.com/office/word/2018/wordml/cex" xmlns:w16cid="http://schemas.microsoft.com/office/word/2016/wordml/cid" xmlns:w16="http://schemas.microsoft.com/office/word/2018/wordml" xmlns:w16du="http://schemas.microsoft.com/office/word/2023/wordml/word16du" xmlns:w16sdtdh="http://schemas.microsoft.com/office/word/2020/wordml/sdtdatahash" xmlns:w16sdtfl="http://schemas.microsoft.com/office/word/2024/wordml/sdtformatlock" xmlns:w16se="http://schemas.microsoft.com/office/word/2015/wordml/symex" xmlns:wpg="http://schemas.microsoft.com/office/word/2010/wordprocessingGroup" xmlns:wpi="http://schemas.microsoft.com/office/word/2010/wordprocessingInk" xmlns:wne="http://schemas.microsoft.com/office/word/2006/wordml" xmlns:wps="http://schemas.microsoft.com/office/word/2010/wordprocessingShape" mc:Ignorable="w14 w15 w16se w16cid w16 w16cex w16sdtdh w16sdtfl w16du wp14">
+<w:footnotes xmlns:wpc="http://schemas.microsoft.com/office/word/2010/wordprocessingCanvas" xmlns:cx="http://schemas.microsoft.com/office/drawing/2014/chartex" xmlns:cx1="http://schemas.microsoft.com/office/drawing/2015/9/8/chartex" xmlns:cx2="http://schemas.microsoft.com/office/drawing/2015/10/21/chartex" xmlns:cx3="http://schemas.microsoft.com/office/drawing/2016/5/9/chartex" xmlns:cx4="http://schemas.microsoft.com/office/drawing/2016/5/10/chartex" xmlns:cx5="http://schemas.microsoft.com/office/drawing/2016/5/11/chartex" xmlns:cx6="http://schemas.microsoft.com/office/drawing/2016/5/12/chartex" xmlns:cx7="http://schemas.microsoft.com/office/drawing/2016/5/13/chartex" xmlns:cx8="http://schemas.microsoft.com/office/drawing/2016/5/14/chartex" xmlns:mc="http://schemas.openxmlformats.org/markup-compatibility/2006" xmlns:aink="http://schemas.microsoft.com/office/drawing/2016/ink" xmlns:am3d="http://schemas.microsoft.com/office/drawing/2017/model3d" xmlns:o="urn:schemas-microsoft-com:office:office" xmlns:r="http://schemas.openxmlformats.org/officeDocument/2006/relationships" xmlns:m="http://schemas.openxmlformats.org/officeDocument/2006/math" xmlns:v="urn:schemas-microsoft-com:vml" xmlns:wp14="http://schemas.microsoft.com/office/word/2010/wordprocessingDrawing" xmlns:wp="http://schemas.openxmlformats.org/drawingml/2006/wordprocessingDrawing" xmlns:w10="urn:schemas-microsoft-com:office:word" xmlns:w="http://schemas.openxmlformats.org/wordprocessingml/2006/main" xmlns:w14="http://schemas.microsoft.com/office/word/2010/wordml" xmlns:w15="http://schemas.microsoft.com/office/word/2012/wordml" xmlns:w16cex="http://schemas.microsoft.com/office/word/2018/wordml/cex" xmlns:w16cid="http://schemas.microsoft.com/office/word/2016/wordml/cid" xmlns:w16="http://schemas.microsoft.com/office/word/2018/wordml" xmlns:w16sdtdh="http://schemas.microsoft.com/office/word/2020/wordml/sdtdatahash" xmlns:w16se="http://schemas.microsoft.com/office/word/2015/wordml/symex" xmlns:wpg="http://schemas.microsoft.com/office/word/2010/wordprocessingGroup" xmlns:wpi="http://schemas.microsoft.com/office/word/2010/wordprocessingInk" xmlns:wne="http://schemas.microsoft.com/office/word/2006/wordml" xmlns:wps="http://schemas.microsoft.com/office/word/2010/wordprocessingShape" mc:Ignorable="w14 w15 w16se w16cid w16 w16cex w16sdtdh wp14">
   <w:footnote w:type="separator" w:id="-1">
     <w:p>
       <w:pPr>
@@ -1500,7 +1562,7 @@
 </file>
 
 <file path=word/header1.xml><?xml version="1.0" encoding="utf-8"?>
-<w:hdr xmlns:wpc="http://schemas.microsoft.com/office/word/2010/wordprocessingCanvas" xmlns:cx="http://schemas.microsoft.com/office/drawing/2014/chartex" xmlns:cx1="http://schemas.microsoft.com/office/drawing/2015/9/8/chartex" xmlns:cx2="http://schemas.microsoft.com/office/drawing/2015/10/21/chartex" xmlns:cx3="http://schemas.microsoft.com/office/drawing/2016/5/9/chartex" xmlns:cx4="http://schemas.microsoft.com/office/drawing/2016/5/10/chartex" xmlns:cx5="http://schemas.microsoft.com/office/drawing/2016/5/11/chartex" xmlns:cx6="http://schemas.microsoft.com/office/drawing/2016/5/12/chartex" xmlns:cx7="http://schemas.microsoft.com/office/drawing/2016/5/13/chartex" xmlns:cx8="http://schemas.microsoft.com/office/drawing/2016/5/14/chartex" xmlns:mc="http://schemas.openxmlformats.org/markup-compatibility/2006" xmlns:aink="http://schemas.microsoft.com/office/drawing/2016/ink" xmlns:am3d="http://schemas.microsoft.com/office/drawing/2017/model3d" xmlns:o="urn:schemas-microsoft-com:office:office" xmlns:oel="http://schemas.microsoft.com/office/2019/extlst" xmlns:r="http://schemas.openxmlformats.org/officeDocument/2006/relationships" xmlns:m="http://schemas.openxmlformats.org/officeDocument/2006/math" xmlns:v="urn:schemas-microsoft-com:vml" xmlns:wp14="http://schemas.microsoft.com/office/word/2010/wordprocessingDrawing" xmlns:wp="http://schemas.openxmlformats.org/drawingml/2006/wordprocessingDrawing" xmlns:w10="urn:schemas-microsoft-com:office:word" xmlns:w="http://schemas.openxmlformats.org/wordprocessingml/2006/main" xmlns:w14="http://schemas.microsoft.com/office/word/2010/wordml" xmlns:w15="http://schemas.microsoft.com/office/word/2012/wordml" xmlns:w16cex="http://schemas.microsoft.com/office/word/2018/wordml/cex" xmlns:w16cid="http://schemas.microsoft.com/office/word/2016/wordml/cid" xmlns:w16="http://schemas.microsoft.com/office/word/2018/wordml" xmlns:w16du="http://schemas.microsoft.com/office/word/2023/wordml/word16du" xmlns:w16sdtdh="http://schemas.microsoft.com/office/word/2020/wordml/sdtdatahash" xmlns:w16sdtfl="http://schemas.microsoft.com/office/word/2024/wordml/sdtformatlock" xmlns:w16se="http://schemas.microsoft.com/office/word/2015/wordml/symex" xmlns:wpg="http://schemas.microsoft.com/office/word/2010/wordprocessingGroup" xmlns:wpi="http://schemas.microsoft.com/office/word/2010/wordprocessingInk" xmlns:wne="http://schemas.microsoft.com/office/word/2006/wordml" xmlns:wps="http://schemas.microsoft.com/office/word/2010/wordprocessingShape" mc:Ignorable="w14 w15 w16se w16cid w16 w16cex w16sdtdh w16sdtfl w16du wp14">
+<w:hdr xmlns:wpc="http://schemas.microsoft.com/office/word/2010/wordprocessingCanvas" xmlns:cx="http://schemas.microsoft.com/office/drawing/2014/chartex" xmlns:cx1="http://schemas.microsoft.com/office/drawing/2015/9/8/chartex" xmlns:cx2="http://schemas.microsoft.com/office/drawing/2015/10/21/chartex" xmlns:cx3="http://schemas.microsoft.com/office/drawing/2016/5/9/chartex" xmlns:cx4="http://schemas.microsoft.com/office/drawing/2016/5/10/chartex" xmlns:cx5="http://schemas.microsoft.com/office/drawing/2016/5/11/chartex" xmlns:cx6="http://schemas.microsoft.com/office/drawing/2016/5/12/chartex" xmlns:cx7="http://schemas.microsoft.com/office/drawing/2016/5/13/chartex" xmlns:cx8="http://schemas.microsoft.com/office/drawing/2016/5/14/chartex" xmlns:mc="http://schemas.openxmlformats.org/markup-compatibility/2006" xmlns:aink="http://schemas.microsoft.com/office/drawing/2016/ink" xmlns:am3d="http://schemas.microsoft.com/office/drawing/2017/model3d" xmlns:o="urn:schemas-microsoft-com:office:office" xmlns:r="http://schemas.openxmlformats.org/officeDocument/2006/relationships" xmlns:m="http://schemas.openxmlformats.org/officeDocument/2006/math" xmlns:v="urn:schemas-microsoft-com:vml" xmlns:wp14="http://schemas.microsoft.com/office/word/2010/wordprocessingDrawing" xmlns:wp="http://schemas.openxmlformats.org/drawingml/2006/wordprocessingDrawing" xmlns:w10="urn:schemas-microsoft-com:office:word" xmlns:w="http://schemas.openxmlformats.org/wordprocessingml/2006/main" xmlns:w14="http://schemas.microsoft.com/office/word/2010/wordml" xmlns:w15="http://schemas.microsoft.com/office/word/2012/wordml" xmlns:w16cex="http://schemas.microsoft.com/office/word/2018/wordml/cex" xmlns:w16cid="http://schemas.microsoft.com/office/word/2016/wordml/cid" xmlns:w16="http://schemas.microsoft.com/office/word/2018/wordml" xmlns:w16sdtdh="http://schemas.microsoft.com/office/word/2020/wordml/sdtdatahash" xmlns:w16se="http://schemas.microsoft.com/office/word/2015/wordml/symex" xmlns:wpg="http://schemas.microsoft.com/office/word/2010/wordprocessingGroup" xmlns:wpi="http://schemas.microsoft.com/office/word/2010/wordprocessingInk" xmlns:wne="http://schemas.microsoft.com/office/word/2006/wordml" xmlns:wps="http://schemas.microsoft.com/office/word/2010/wordprocessingShape" mc:Ignorable="w14 w15 w16se w16cid w16 w16cex w16sdtdh wp14">
   <w:p>
     <w:pPr>
       <w:pStyle w:val="Header"/>
@@ -1520,7 +1582,7 @@
 </file>
 
 <file path=word/numbering.xml><?xml version="1.0" encoding="utf-8"?>
-<w:numbering xmlns:wpc="http://schemas.microsoft.com/office/word/2010/wordprocessingCanvas" xmlns:cx="http://schemas.microsoft.com/office/drawing/2014/chartex" xmlns:cx1="http://schemas.microsoft.com/office/drawing/2015/9/8/chartex" xmlns:cx2="http://schemas.microsoft.com/office/drawing/2015/10/21/chartex" xmlns:cx3="http://schemas.microsoft.com/office/drawing/2016/5/9/chartex" xmlns:cx4="http://schemas.microsoft.com/office/drawing/2016/5/10/chartex" xmlns:cx5="http://schemas.microsoft.com/office/drawing/2016/5/11/chartex" xmlns:cx6="http://schemas.microsoft.com/office/drawing/2016/5/12/chartex" xmlns:cx7="http://schemas.microsoft.com/office/drawing/2016/5/13/chartex" xmlns:cx8="http://schemas.microsoft.com/office/drawing/2016/5/14/chartex" xmlns:mc="http://schemas.openxmlformats.org/markup-compatibility/2006" xmlns:aink="http://schemas.microsoft.com/office/drawing/2016/ink" xmlns:am3d="http://schemas.microsoft.com/office/drawing/2017/model3d" xmlns:o="urn:schemas-microsoft-com:office:office" xmlns:oel="http://schemas.microsoft.com/office/2019/extlst" xmlns:r="http://schemas.openxmlformats.org/officeDocument/2006/relationships" xmlns:m="http://schemas.openxmlformats.org/officeDocument/2006/math" xmlns:v="urn:schemas-microsoft-com:vml" xmlns:wp14="http://schemas.microsoft.com/office/word/2010/wordprocessingDrawing" xmlns:wp="http://schemas.openxmlformats.org/drawingml/2006/wordprocessingDrawing" xmlns:w10="urn:schemas-microsoft-com:office:word" xmlns:w="http://schemas.openxmlformats.org/wordprocessingml/2006/main" xmlns:w14="http://schemas.microsoft.com/office/word/2010/wordml" xmlns:w15="http://schemas.microsoft.com/office/word/2012/wordml" xmlns:w16cex="http://schemas.microsoft.com/office/word/2018/wordml/cex" xmlns:w16cid="http://schemas.microsoft.com/office/word/2016/wordml/cid" xmlns:w16="http://schemas.microsoft.com/office/word/2018/wordml" xmlns:w16du="http://schemas.microsoft.com/office/word/2023/wordml/word16du" xmlns:w16sdtdh="http://schemas.microsoft.com/office/word/2020/wordml/sdtdatahash" xmlns:w16sdtfl="http://schemas.microsoft.com/office/word/2024/wordml/sdtformatlock" xmlns:w16se="http://schemas.microsoft.com/office/word/2015/wordml/symex" xmlns:wpg="http://schemas.microsoft.com/office/word/2010/wordprocessingGroup" xmlns:wpi="http://schemas.microsoft.com/office/word/2010/wordprocessingInk" xmlns:wne="http://schemas.microsoft.com/office/word/2006/wordml" xmlns:wps="http://schemas.microsoft.com/office/word/2010/wordprocessingShape" mc:Ignorable="w14 w15 w16se w16cid w16 w16cex w16sdtdh w16sdtfl w16du wp14">
+<w:numbering xmlns:wpc="http://schemas.microsoft.com/office/word/2010/wordprocessingCanvas" xmlns:cx="http://schemas.microsoft.com/office/drawing/2014/chartex" xmlns:cx1="http://schemas.microsoft.com/office/drawing/2015/9/8/chartex" xmlns:cx2="http://schemas.microsoft.com/office/drawing/2015/10/21/chartex" xmlns:cx3="http://schemas.microsoft.com/office/drawing/2016/5/9/chartex" xmlns:cx4="http://schemas.microsoft.com/office/drawing/2016/5/10/chartex" xmlns:cx5="http://schemas.microsoft.com/office/drawing/2016/5/11/chartex" xmlns:cx6="http://schemas.microsoft.com/office/drawing/2016/5/12/chartex" xmlns:cx7="http://schemas.microsoft.com/office/drawing/2016/5/13/chartex" xmlns:cx8="http://schemas.microsoft.com/office/drawing/2016/5/14/chartex" xmlns:mc="http://schemas.openxmlformats.org/markup-compatibility/2006" xmlns:aink="http://schemas.microsoft.com/office/drawing/2016/ink" xmlns:am3d="http://schemas.microsoft.com/office/drawing/2017/model3d" xmlns:o="urn:schemas-microsoft-com:office:office" xmlns:r="http://schemas.openxmlformats.org/officeDocument/2006/relationships" xmlns:m="http://schemas.openxmlformats.org/officeDocument/2006/math" xmlns:v="urn:schemas-microsoft-com:vml" xmlns:wp14="http://schemas.microsoft.com/office/word/2010/wordprocessingDrawing" xmlns:wp="http://schemas.openxmlformats.org/drawingml/2006/wordprocessingDrawing" xmlns:w10="urn:schemas-microsoft-com:office:word" xmlns:w="http://schemas.openxmlformats.org/wordprocessingml/2006/main" xmlns:w14="http://schemas.microsoft.com/office/word/2010/wordml" xmlns:w15="http://schemas.microsoft.com/office/word/2012/wordml" xmlns:w16cex="http://schemas.microsoft.com/office/word/2018/wordml/cex" xmlns:w16cid="http://schemas.microsoft.com/office/word/2016/wordml/cid" xmlns:w16="http://schemas.microsoft.com/office/word/2018/wordml" xmlns:w16sdtdh="http://schemas.microsoft.com/office/word/2020/wordml/sdtdatahash" xmlns:w16se="http://schemas.microsoft.com/office/word/2015/wordml/symex" xmlns:wpg="http://schemas.microsoft.com/office/word/2010/wordprocessingGroup" xmlns:wpi="http://schemas.microsoft.com/office/word/2010/wordprocessingInk" xmlns:wne="http://schemas.microsoft.com/office/word/2006/wordml" xmlns:wps="http://schemas.microsoft.com/office/word/2010/wordprocessingShape" mc:Ignorable="w14 w15 w16se w16cid w16 w16cex w16sdtdh wp14">
   <w:abstractNum w:abstractNumId="0" w15:restartNumberingAfterBreak="0">
     <w:nsid w:val="011D5CF4"/>
     <w:multiLevelType w:val="hybridMultilevel"/>
@@ -1860,20 +1922,20 @@
       </w:rPr>
     </w:lvl>
   </w:abstractNum>
-  <w:num w:numId="1" w16cid:durableId="832599220">
+  <w:num w:numId="1">
     <w:abstractNumId w:val="0"/>
   </w:num>
-  <w:num w:numId="2" w16cid:durableId="1630816385">
+  <w:num w:numId="2">
     <w:abstractNumId w:val="2"/>
   </w:num>
-  <w:num w:numId="3" w16cid:durableId="2123378272">
+  <w:num w:numId="3">
     <w:abstractNumId w:val="1"/>
   </w:num>
 </w:numbering>
 </file>
 
 <file path=word/styles.xml><?xml version="1.0" encoding="utf-8"?>
-<w:styles xmlns:mc="http://schemas.openxmlformats.org/markup-compatibility/2006" xmlns:r="http://schemas.openxmlformats.org/officeDocument/2006/relationships" xmlns:w="http://schemas.openxmlformats.org/wordprocessingml/2006/main" xmlns:w14="http://schemas.microsoft.com/office/word/2010/wordml" xmlns:w15="http://schemas.microsoft.com/office/word/2012/wordml" xmlns:w16cex="http://schemas.microsoft.com/office/word/2018/wordml/cex" xmlns:w16cid="http://schemas.microsoft.com/office/word/2016/wordml/cid" xmlns:w16="http://schemas.microsoft.com/office/word/2018/wordml" xmlns:w16du="http://schemas.microsoft.com/office/word/2023/wordml/word16du" xmlns:w16sdtdh="http://schemas.microsoft.com/office/word/2020/wordml/sdtdatahash" xmlns:w16sdtfl="http://schemas.microsoft.com/office/word/2024/wordml/sdtformatlock" xmlns:w16se="http://schemas.microsoft.com/office/word/2015/wordml/symex" mc:Ignorable="w14 w15 w16se w16cid w16 w16cex w16sdtdh w16sdtfl w16du">
+<w:styles xmlns:mc="http://schemas.openxmlformats.org/markup-compatibility/2006" xmlns:r="http://schemas.openxmlformats.org/officeDocument/2006/relationships" xmlns:w="http://schemas.openxmlformats.org/wordprocessingml/2006/main" xmlns:w14="http://schemas.microsoft.com/office/word/2010/wordml" xmlns:w15="http://schemas.microsoft.com/office/word/2012/wordml" xmlns:w16cex="http://schemas.microsoft.com/office/word/2018/wordml/cex" xmlns:w16cid="http://schemas.microsoft.com/office/word/2016/wordml/cid" xmlns:w16="http://schemas.microsoft.com/office/word/2018/wordml" xmlns:w16sdtdh="http://schemas.microsoft.com/office/word/2020/wordml/sdtdatahash" xmlns:w16se="http://schemas.microsoft.com/office/word/2015/wordml/symex" mc:Ignorable="w14 w15 w16se w16cid w16 w16cex w16sdtdh">
   <w:docDefaults>
     <w:rPrDefault>
       <w:rPr>

</xml_diff>

<commit_message>
plugin added and locale storage added
</commit_message>
<xml_diff>
--- a/Assignment/Assignment.docx
+++ b/Assignment/Assignment.docx
@@ -1,6 +1,6 @@
 
 <file path=word/document.xml><?xml version="1.0" encoding="utf-8"?>
-<w:document xmlns:wpc="http://schemas.microsoft.com/office/word/2010/wordprocessingCanvas" xmlns:cx="http://schemas.microsoft.com/office/drawing/2014/chartex" xmlns:cx1="http://schemas.microsoft.com/office/drawing/2015/9/8/chartex" xmlns:cx2="http://schemas.microsoft.com/office/drawing/2015/10/21/chartex" xmlns:cx3="http://schemas.microsoft.com/office/drawing/2016/5/9/chartex" xmlns:cx4="http://schemas.microsoft.com/office/drawing/2016/5/10/chartex" xmlns:cx5="http://schemas.microsoft.com/office/drawing/2016/5/11/chartex" xmlns:cx6="http://schemas.microsoft.com/office/drawing/2016/5/12/chartex" xmlns:cx7="http://schemas.microsoft.com/office/drawing/2016/5/13/chartex" xmlns:cx8="http://schemas.microsoft.com/office/drawing/2016/5/14/chartex" xmlns:mc="http://schemas.openxmlformats.org/markup-compatibility/2006" xmlns:aink="http://schemas.microsoft.com/office/drawing/2016/ink" xmlns:am3d="http://schemas.microsoft.com/office/drawing/2017/model3d" xmlns:o="urn:schemas-microsoft-com:office:office" xmlns:r="http://schemas.openxmlformats.org/officeDocument/2006/relationships" xmlns:m="http://schemas.openxmlformats.org/officeDocument/2006/math" xmlns:v="urn:schemas-microsoft-com:vml" xmlns:wp14="http://schemas.microsoft.com/office/word/2010/wordprocessingDrawing" xmlns:wp="http://schemas.openxmlformats.org/drawingml/2006/wordprocessingDrawing" xmlns:w10="urn:schemas-microsoft-com:office:word" xmlns:w="http://schemas.openxmlformats.org/wordprocessingml/2006/main" xmlns:w14="http://schemas.microsoft.com/office/word/2010/wordml" xmlns:w15="http://schemas.microsoft.com/office/word/2012/wordml" xmlns:w16cex="http://schemas.microsoft.com/office/word/2018/wordml/cex" xmlns:w16cid="http://schemas.microsoft.com/office/word/2016/wordml/cid" xmlns:w16="http://schemas.microsoft.com/office/word/2018/wordml" xmlns:w16sdtdh="http://schemas.microsoft.com/office/word/2020/wordml/sdtdatahash" xmlns:w16se="http://schemas.microsoft.com/office/word/2015/wordml/symex" xmlns:wpg="http://schemas.microsoft.com/office/word/2010/wordprocessingGroup" xmlns:wpi="http://schemas.microsoft.com/office/word/2010/wordprocessingInk" xmlns:wne="http://schemas.microsoft.com/office/word/2006/wordml" xmlns:wps="http://schemas.microsoft.com/office/word/2010/wordprocessingShape" mc:Ignorable="w14 w15 w16se w16cid w16 w16cex w16sdtdh wp14">
+<w:document xmlns:wpc="http://schemas.microsoft.com/office/word/2010/wordprocessingCanvas" xmlns:cx="http://schemas.microsoft.com/office/drawing/2014/chartex" xmlns:cx1="http://schemas.microsoft.com/office/drawing/2015/9/8/chartex" xmlns:cx2="http://schemas.microsoft.com/office/drawing/2015/10/21/chartex" xmlns:cx3="http://schemas.microsoft.com/office/drawing/2016/5/9/chartex" xmlns:cx4="http://schemas.microsoft.com/office/drawing/2016/5/10/chartex" xmlns:cx5="http://schemas.microsoft.com/office/drawing/2016/5/11/chartex" xmlns:cx6="http://schemas.microsoft.com/office/drawing/2016/5/12/chartex" xmlns:cx7="http://schemas.microsoft.com/office/drawing/2016/5/13/chartex" xmlns:cx8="http://schemas.microsoft.com/office/drawing/2016/5/14/chartex" xmlns:mc="http://schemas.openxmlformats.org/markup-compatibility/2006" xmlns:aink="http://schemas.microsoft.com/office/drawing/2016/ink" xmlns:am3d="http://schemas.microsoft.com/office/drawing/2017/model3d" xmlns:o="urn:schemas-microsoft-com:office:office" xmlns:oel="http://schemas.microsoft.com/office/2019/extlst" xmlns:r="http://schemas.openxmlformats.org/officeDocument/2006/relationships" xmlns:m="http://schemas.openxmlformats.org/officeDocument/2006/math" xmlns:v="urn:schemas-microsoft-com:vml" xmlns:wp14="http://schemas.microsoft.com/office/word/2010/wordprocessingDrawing" xmlns:wp="http://schemas.openxmlformats.org/drawingml/2006/wordprocessingDrawing" xmlns:w10="urn:schemas-microsoft-com:office:word" xmlns:w="http://schemas.openxmlformats.org/wordprocessingml/2006/main" xmlns:w14="http://schemas.microsoft.com/office/word/2010/wordml" xmlns:w15="http://schemas.microsoft.com/office/word/2012/wordml" xmlns:w16cex="http://schemas.microsoft.com/office/word/2018/wordml/cex" xmlns:w16cid="http://schemas.microsoft.com/office/word/2016/wordml/cid" xmlns:w16="http://schemas.microsoft.com/office/word/2018/wordml" xmlns:w16du="http://schemas.microsoft.com/office/word/2023/wordml/word16du" xmlns:w16sdtdh="http://schemas.microsoft.com/office/word/2020/wordml/sdtdatahash" xmlns:w16sdtfl="http://schemas.microsoft.com/office/word/2024/wordml/sdtformatlock" xmlns:w16se="http://schemas.microsoft.com/office/word/2015/wordml/symex" xmlns:wpg="http://schemas.microsoft.com/office/word/2010/wordprocessingGroup" xmlns:wpi="http://schemas.microsoft.com/office/word/2010/wordprocessingInk" xmlns:wne="http://schemas.microsoft.com/office/word/2006/wordml" xmlns:wps="http://schemas.microsoft.com/office/word/2010/wordprocessingShape" mc:Ignorable="w14 w15 w16se w16cid w16 w16cex w16sdtdh w16sdtfl w16du wp14">
   <w:body>
     <w:p>
       <w:pPr>
@@ -679,23 +679,7 @@
           <w:sz w:val="18"/>
           <w:szCs w:val="18"/>
         </w:rPr>
-        <w:t xml:space="preserve">Try show off another </w:t>
-      </w:r>
-      <w:proofErr w:type="gramStart"/>
-      <w:r>
-        <w:rPr>
-          <w:sz w:val="18"/>
-          <w:szCs w:val="18"/>
-        </w:rPr>
-        <w:t>feature</w:t>
-      </w:r>
-      <w:proofErr w:type="gramEnd"/>
-      <w:r>
-        <w:rPr>
-          <w:sz w:val="18"/>
-          <w:szCs w:val="18"/>
-        </w:rPr>
-        <w:t xml:space="preserve"> if possible</w:t>
+        <w:t>Try show off another feature if possible</w:t>
       </w:r>
       <w:r>
         <w:rPr>
@@ -1202,6 +1186,7 @@
           <w:bCs/>
           <w:sz w:val="18"/>
           <w:szCs w:val="18"/>
+          <w:highlight w:val="green"/>
           <w:u w:val="single"/>
         </w:rPr>
       </w:pPr>
@@ -1209,6 +1194,7 @@
         <w:rPr>
           <w:sz w:val="18"/>
           <w:szCs w:val="18"/>
+          <w:highlight w:val="green"/>
         </w:rPr>
         <w:t>Back up data</w:t>
       </w:r>
@@ -1216,6 +1202,7 @@
         <w:rPr>
           <w:sz w:val="18"/>
           <w:szCs w:val="18"/>
+          <w:highlight w:val="green"/>
         </w:rPr>
         <w:t xml:space="preserve"> (Should be okay leave til the end)</w:t>
       </w:r>
@@ -1355,6 +1342,7 @@
           <w:bCs/>
           <w:sz w:val="18"/>
           <w:szCs w:val="18"/>
+          <w:highlight w:val="green"/>
           <w:u w:val="single"/>
         </w:rPr>
       </w:pPr>
@@ -1362,6 +1350,7 @@
         <w:rPr>
           <w:sz w:val="18"/>
           <w:szCs w:val="18"/>
+          <w:highlight w:val="green"/>
         </w:rPr>
         <w:t xml:space="preserve">Make new comments push to start </w:t>
       </w:r>
@@ -1386,15 +1375,9 @@
         <w:rPr>
           <w:sz w:val="18"/>
           <w:szCs w:val="18"/>
-        </w:rPr>
-        <w:t>Add a</w:t>
-      </w:r>
-      <w:r>
-        <w:rPr>
-          <w:sz w:val="18"/>
-          <w:szCs w:val="18"/>
-        </w:rPr>
-        <w:t>n easy plugin</w:t>
+          <w:highlight w:val="green"/>
+        </w:rPr>
+        <w:t>Add an easy plugin</w:t>
       </w:r>
     </w:p>
     <w:p>
@@ -1434,6 +1417,7 @@
           <w:bCs/>
           <w:sz w:val="18"/>
           <w:szCs w:val="18"/>
+          <w:highlight w:val="green"/>
           <w:u w:val="single"/>
         </w:rPr>
       </w:pPr>
@@ -1441,6 +1425,7 @@
         <w:rPr>
           <w:sz w:val="18"/>
           <w:szCs w:val="18"/>
+          <w:highlight w:val="green"/>
         </w:rPr>
         <w:t>Tidy up CSS and overall look of page</w:t>
       </w:r>
@@ -1448,6 +1433,7 @@
         <w:rPr>
           <w:sz w:val="18"/>
           <w:szCs w:val="18"/>
+          <w:highlight w:val="green"/>
         </w:rPr>
         <w:t xml:space="preserve"> </w:t>
       </w:r>
@@ -1465,6 +1451,7 @@
           <w:bCs/>
           <w:sz w:val="18"/>
           <w:szCs w:val="18"/>
+          <w:highlight w:val="green"/>
           <w:u w:val="single"/>
         </w:rPr>
       </w:pPr>
@@ -1472,6 +1459,7 @@
         <w:rPr>
           <w:sz w:val="18"/>
           <w:szCs w:val="18"/>
+          <w:highlight w:val="green"/>
         </w:rPr>
         <w:t>Organise Code</w:t>
       </w:r>
@@ -1512,7 +1500,7 @@
 </file>
 
 <file path=word/endnotes.xml><?xml version="1.0" encoding="utf-8"?>
-<w:endnotes xmlns:wpc="http://schemas.microsoft.com/office/word/2010/wordprocessingCanvas" xmlns:cx="http://schemas.microsoft.com/office/drawing/2014/chartex" xmlns:cx1="http://schemas.microsoft.com/office/drawing/2015/9/8/chartex" xmlns:cx2="http://schemas.microsoft.com/office/drawing/2015/10/21/chartex" xmlns:cx3="http://schemas.microsoft.com/office/drawing/2016/5/9/chartex" xmlns:cx4="http://schemas.microsoft.com/office/drawing/2016/5/10/chartex" xmlns:cx5="http://schemas.microsoft.com/office/drawing/2016/5/11/chartex" xmlns:cx6="http://schemas.microsoft.com/office/drawing/2016/5/12/chartex" xmlns:cx7="http://schemas.microsoft.com/office/drawing/2016/5/13/chartex" xmlns:cx8="http://schemas.microsoft.com/office/drawing/2016/5/14/chartex" xmlns:mc="http://schemas.openxmlformats.org/markup-compatibility/2006" xmlns:aink="http://schemas.microsoft.com/office/drawing/2016/ink" xmlns:am3d="http://schemas.microsoft.com/office/drawing/2017/model3d" xmlns:o="urn:schemas-microsoft-com:office:office" xmlns:r="http://schemas.openxmlformats.org/officeDocument/2006/relationships" xmlns:m="http://schemas.openxmlformats.org/officeDocument/2006/math" xmlns:v="urn:schemas-microsoft-com:vml" xmlns:wp14="http://schemas.microsoft.com/office/word/2010/wordprocessingDrawing" xmlns:wp="http://schemas.openxmlformats.org/drawingml/2006/wordprocessingDrawing" xmlns:w10="urn:schemas-microsoft-com:office:word" xmlns:w="http://schemas.openxmlformats.org/wordprocessingml/2006/main" xmlns:w14="http://schemas.microsoft.com/office/word/2010/wordml" xmlns:w15="http://schemas.microsoft.com/office/word/2012/wordml" xmlns:w16cex="http://schemas.microsoft.com/office/word/2018/wordml/cex" xmlns:w16cid="http://schemas.microsoft.com/office/word/2016/wordml/cid" xmlns:w16="http://schemas.microsoft.com/office/word/2018/wordml" xmlns:w16sdtdh="http://schemas.microsoft.com/office/word/2020/wordml/sdtdatahash" xmlns:w16se="http://schemas.microsoft.com/office/word/2015/wordml/symex" xmlns:wpg="http://schemas.microsoft.com/office/word/2010/wordprocessingGroup" xmlns:wpi="http://schemas.microsoft.com/office/word/2010/wordprocessingInk" xmlns:wne="http://schemas.microsoft.com/office/word/2006/wordml" xmlns:wps="http://schemas.microsoft.com/office/word/2010/wordprocessingShape" mc:Ignorable="w14 w15 w16se w16cid w16 w16cex w16sdtdh wp14">
+<w:endnotes xmlns:wpc="http://schemas.microsoft.com/office/word/2010/wordprocessingCanvas" xmlns:cx="http://schemas.microsoft.com/office/drawing/2014/chartex" xmlns:cx1="http://schemas.microsoft.com/office/drawing/2015/9/8/chartex" xmlns:cx2="http://schemas.microsoft.com/office/drawing/2015/10/21/chartex" xmlns:cx3="http://schemas.microsoft.com/office/drawing/2016/5/9/chartex" xmlns:cx4="http://schemas.microsoft.com/office/drawing/2016/5/10/chartex" xmlns:cx5="http://schemas.microsoft.com/office/drawing/2016/5/11/chartex" xmlns:cx6="http://schemas.microsoft.com/office/drawing/2016/5/12/chartex" xmlns:cx7="http://schemas.microsoft.com/office/drawing/2016/5/13/chartex" xmlns:cx8="http://schemas.microsoft.com/office/drawing/2016/5/14/chartex" xmlns:mc="http://schemas.openxmlformats.org/markup-compatibility/2006" xmlns:aink="http://schemas.microsoft.com/office/drawing/2016/ink" xmlns:am3d="http://schemas.microsoft.com/office/drawing/2017/model3d" xmlns:o="urn:schemas-microsoft-com:office:office" xmlns:oel="http://schemas.microsoft.com/office/2019/extlst" xmlns:r="http://schemas.openxmlformats.org/officeDocument/2006/relationships" xmlns:m="http://schemas.openxmlformats.org/officeDocument/2006/math" xmlns:v="urn:schemas-microsoft-com:vml" xmlns:wp14="http://schemas.microsoft.com/office/word/2010/wordprocessingDrawing" xmlns:wp="http://schemas.openxmlformats.org/drawingml/2006/wordprocessingDrawing" xmlns:w10="urn:schemas-microsoft-com:office:word" xmlns:w="http://schemas.openxmlformats.org/wordprocessingml/2006/main" xmlns:w14="http://schemas.microsoft.com/office/word/2010/wordml" xmlns:w15="http://schemas.microsoft.com/office/word/2012/wordml" xmlns:w16cex="http://schemas.microsoft.com/office/word/2018/wordml/cex" xmlns:w16cid="http://schemas.microsoft.com/office/word/2016/wordml/cid" xmlns:w16="http://schemas.microsoft.com/office/word/2018/wordml" xmlns:w16du="http://schemas.microsoft.com/office/word/2023/wordml/word16du" xmlns:w16sdtdh="http://schemas.microsoft.com/office/word/2020/wordml/sdtdatahash" xmlns:w16sdtfl="http://schemas.microsoft.com/office/word/2024/wordml/sdtformatlock" xmlns:w16se="http://schemas.microsoft.com/office/word/2015/wordml/symex" xmlns:wpg="http://schemas.microsoft.com/office/word/2010/wordprocessingGroup" xmlns:wpi="http://schemas.microsoft.com/office/word/2010/wordprocessingInk" xmlns:wne="http://schemas.microsoft.com/office/word/2006/wordml" xmlns:wps="http://schemas.microsoft.com/office/word/2010/wordprocessingShape" mc:Ignorable="w14 w15 w16se w16cid w16 w16cex w16sdtdh w16sdtfl w16du wp14">
   <w:endnote w:type="separator" w:id="-1">
     <w:p>
       <w:pPr>
@@ -1537,7 +1525,7 @@
 </file>
 
 <file path=word/footnotes.xml><?xml version="1.0" encoding="utf-8"?>
-<w:footnotes xmlns:wpc="http://schemas.microsoft.com/office/word/2010/wordprocessingCanvas" xmlns:cx="http://schemas.microsoft.com/office/drawing/2014/chartex" xmlns:cx1="http://schemas.microsoft.com/office/drawing/2015/9/8/chartex" xmlns:cx2="http://schemas.microsoft.com/office/drawing/2015/10/21/chartex" xmlns:cx3="http://schemas.microsoft.com/office/drawing/2016/5/9/chartex" xmlns:cx4="http://schemas.microsoft.com/office/drawing/2016/5/10/chartex" xmlns:cx5="http://schemas.microsoft.com/office/drawing/2016/5/11/chartex" xmlns:cx6="http://schemas.microsoft.com/office/drawing/2016/5/12/chartex" xmlns:cx7="http://schemas.microsoft.com/office/drawing/2016/5/13/chartex" xmlns:cx8="http://schemas.microsoft.com/office/drawing/2016/5/14/chartex" xmlns:mc="http://schemas.openxmlformats.org/markup-compatibility/2006" xmlns:aink="http://schemas.microsoft.com/office/drawing/2016/ink" xmlns:am3d="http://schemas.microsoft.com/office/drawing/2017/model3d" xmlns:o="urn:schemas-microsoft-com:office:office" xmlns:r="http://schemas.openxmlformats.org/officeDocument/2006/relationships" xmlns:m="http://schemas.openxmlformats.org/officeDocument/2006/math" xmlns:v="urn:schemas-microsoft-com:vml" xmlns:wp14="http://schemas.microsoft.com/office/word/2010/wordprocessingDrawing" xmlns:wp="http://schemas.openxmlformats.org/drawingml/2006/wordprocessingDrawing" xmlns:w10="urn:schemas-microsoft-com:office:word" xmlns:w="http://schemas.openxmlformats.org/wordprocessingml/2006/main" xmlns:w14="http://schemas.microsoft.com/office/word/2010/wordml" xmlns:w15="http://schemas.microsoft.com/office/word/2012/wordml" xmlns:w16cex="http://schemas.microsoft.com/office/word/2018/wordml/cex" xmlns:w16cid="http://schemas.microsoft.com/office/word/2016/wordml/cid" xmlns:w16="http://schemas.microsoft.com/office/word/2018/wordml" xmlns:w16sdtdh="http://schemas.microsoft.com/office/word/2020/wordml/sdtdatahash" xmlns:w16se="http://schemas.microsoft.com/office/word/2015/wordml/symex" xmlns:wpg="http://schemas.microsoft.com/office/word/2010/wordprocessingGroup" xmlns:wpi="http://schemas.microsoft.com/office/word/2010/wordprocessingInk" xmlns:wne="http://schemas.microsoft.com/office/word/2006/wordml" xmlns:wps="http://schemas.microsoft.com/office/word/2010/wordprocessingShape" mc:Ignorable="w14 w15 w16se w16cid w16 w16cex w16sdtdh wp14">
+<w:footnotes xmlns:wpc="http://schemas.microsoft.com/office/word/2010/wordprocessingCanvas" xmlns:cx="http://schemas.microsoft.com/office/drawing/2014/chartex" xmlns:cx1="http://schemas.microsoft.com/office/drawing/2015/9/8/chartex" xmlns:cx2="http://schemas.microsoft.com/office/drawing/2015/10/21/chartex" xmlns:cx3="http://schemas.microsoft.com/office/drawing/2016/5/9/chartex" xmlns:cx4="http://schemas.microsoft.com/office/drawing/2016/5/10/chartex" xmlns:cx5="http://schemas.microsoft.com/office/drawing/2016/5/11/chartex" xmlns:cx6="http://schemas.microsoft.com/office/drawing/2016/5/12/chartex" xmlns:cx7="http://schemas.microsoft.com/office/drawing/2016/5/13/chartex" xmlns:cx8="http://schemas.microsoft.com/office/drawing/2016/5/14/chartex" xmlns:mc="http://schemas.openxmlformats.org/markup-compatibility/2006" xmlns:aink="http://schemas.microsoft.com/office/drawing/2016/ink" xmlns:am3d="http://schemas.microsoft.com/office/drawing/2017/model3d" xmlns:o="urn:schemas-microsoft-com:office:office" xmlns:oel="http://schemas.microsoft.com/office/2019/extlst" xmlns:r="http://schemas.openxmlformats.org/officeDocument/2006/relationships" xmlns:m="http://schemas.openxmlformats.org/officeDocument/2006/math" xmlns:v="urn:schemas-microsoft-com:vml" xmlns:wp14="http://schemas.microsoft.com/office/word/2010/wordprocessingDrawing" xmlns:wp="http://schemas.openxmlformats.org/drawingml/2006/wordprocessingDrawing" xmlns:w10="urn:schemas-microsoft-com:office:word" xmlns:w="http://schemas.openxmlformats.org/wordprocessingml/2006/main" xmlns:w14="http://schemas.microsoft.com/office/word/2010/wordml" xmlns:w15="http://schemas.microsoft.com/office/word/2012/wordml" xmlns:w16cex="http://schemas.microsoft.com/office/word/2018/wordml/cex" xmlns:w16cid="http://schemas.microsoft.com/office/word/2016/wordml/cid" xmlns:w16="http://schemas.microsoft.com/office/word/2018/wordml" xmlns:w16du="http://schemas.microsoft.com/office/word/2023/wordml/word16du" xmlns:w16sdtdh="http://schemas.microsoft.com/office/word/2020/wordml/sdtdatahash" xmlns:w16sdtfl="http://schemas.microsoft.com/office/word/2024/wordml/sdtformatlock" xmlns:w16se="http://schemas.microsoft.com/office/word/2015/wordml/symex" xmlns:wpg="http://schemas.microsoft.com/office/word/2010/wordprocessingGroup" xmlns:wpi="http://schemas.microsoft.com/office/word/2010/wordprocessingInk" xmlns:wne="http://schemas.microsoft.com/office/word/2006/wordml" xmlns:wps="http://schemas.microsoft.com/office/word/2010/wordprocessingShape" mc:Ignorable="w14 w15 w16se w16cid w16 w16cex w16sdtdh w16sdtfl w16du wp14">
   <w:footnote w:type="separator" w:id="-1">
     <w:p>
       <w:pPr>
@@ -1562,7 +1550,7 @@
 </file>
 
 <file path=word/header1.xml><?xml version="1.0" encoding="utf-8"?>
-<w:hdr xmlns:wpc="http://schemas.microsoft.com/office/word/2010/wordprocessingCanvas" xmlns:cx="http://schemas.microsoft.com/office/drawing/2014/chartex" xmlns:cx1="http://schemas.microsoft.com/office/drawing/2015/9/8/chartex" xmlns:cx2="http://schemas.microsoft.com/office/drawing/2015/10/21/chartex" xmlns:cx3="http://schemas.microsoft.com/office/drawing/2016/5/9/chartex" xmlns:cx4="http://schemas.microsoft.com/office/drawing/2016/5/10/chartex" xmlns:cx5="http://schemas.microsoft.com/office/drawing/2016/5/11/chartex" xmlns:cx6="http://schemas.microsoft.com/office/drawing/2016/5/12/chartex" xmlns:cx7="http://schemas.microsoft.com/office/drawing/2016/5/13/chartex" xmlns:cx8="http://schemas.microsoft.com/office/drawing/2016/5/14/chartex" xmlns:mc="http://schemas.openxmlformats.org/markup-compatibility/2006" xmlns:aink="http://schemas.microsoft.com/office/drawing/2016/ink" xmlns:am3d="http://schemas.microsoft.com/office/drawing/2017/model3d" xmlns:o="urn:schemas-microsoft-com:office:office" xmlns:r="http://schemas.openxmlformats.org/officeDocument/2006/relationships" xmlns:m="http://schemas.openxmlformats.org/officeDocument/2006/math" xmlns:v="urn:schemas-microsoft-com:vml" xmlns:wp14="http://schemas.microsoft.com/office/word/2010/wordprocessingDrawing" xmlns:wp="http://schemas.openxmlformats.org/drawingml/2006/wordprocessingDrawing" xmlns:w10="urn:schemas-microsoft-com:office:word" xmlns:w="http://schemas.openxmlformats.org/wordprocessingml/2006/main" xmlns:w14="http://schemas.microsoft.com/office/word/2010/wordml" xmlns:w15="http://schemas.microsoft.com/office/word/2012/wordml" xmlns:w16cex="http://schemas.microsoft.com/office/word/2018/wordml/cex" xmlns:w16cid="http://schemas.microsoft.com/office/word/2016/wordml/cid" xmlns:w16="http://schemas.microsoft.com/office/word/2018/wordml" xmlns:w16sdtdh="http://schemas.microsoft.com/office/word/2020/wordml/sdtdatahash" xmlns:w16se="http://schemas.microsoft.com/office/word/2015/wordml/symex" xmlns:wpg="http://schemas.microsoft.com/office/word/2010/wordprocessingGroup" xmlns:wpi="http://schemas.microsoft.com/office/word/2010/wordprocessingInk" xmlns:wne="http://schemas.microsoft.com/office/word/2006/wordml" xmlns:wps="http://schemas.microsoft.com/office/word/2010/wordprocessingShape" mc:Ignorable="w14 w15 w16se w16cid w16 w16cex w16sdtdh wp14">
+<w:hdr xmlns:wpc="http://schemas.microsoft.com/office/word/2010/wordprocessingCanvas" xmlns:cx="http://schemas.microsoft.com/office/drawing/2014/chartex" xmlns:cx1="http://schemas.microsoft.com/office/drawing/2015/9/8/chartex" xmlns:cx2="http://schemas.microsoft.com/office/drawing/2015/10/21/chartex" xmlns:cx3="http://schemas.microsoft.com/office/drawing/2016/5/9/chartex" xmlns:cx4="http://schemas.microsoft.com/office/drawing/2016/5/10/chartex" xmlns:cx5="http://schemas.microsoft.com/office/drawing/2016/5/11/chartex" xmlns:cx6="http://schemas.microsoft.com/office/drawing/2016/5/12/chartex" xmlns:cx7="http://schemas.microsoft.com/office/drawing/2016/5/13/chartex" xmlns:cx8="http://schemas.microsoft.com/office/drawing/2016/5/14/chartex" xmlns:mc="http://schemas.openxmlformats.org/markup-compatibility/2006" xmlns:aink="http://schemas.microsoft.com/office/drawing/2016/ink" xmlns:am3d="http://schemas.microsoft.com/office/drawing/2017/model3d" xmlns:o="urn:schemas-microsoft-com:office:office" xmlns:oel="http://schemas.microsoft.com/office/2019/extlst" xmlns:r="http://schemas.openxmlformats.org/officeDocument/2006/relationships" xmlns:m="http://schemas.openxmlformats.org/officeDocument/2006/math" xmlns:v="urn:schemas-microsoft-com:vml" xmlns:wp14="http://schemas.microsoft.com/office/word/2010/wordprocessingDrawing" xmlns:wp="http://schemas.openxmlformats.org/drawingml/2006/wordprocessingDrawing" xmlns:w10="urn:schemas-microsoft-com:office:word" xmlns:w="http://schemas.openxmlformats.org/wordprocessingml/2006/main" xmlns:w14="http://schemas.microsoft.com/office/word/2010/wordml" xmlns:w15="http://schemas.microsoft.com/office/word/2012/wordml" xmlns:w16cex="http://schemas.microsoft.com/office/word/2018/wordml/cex" xmlns:w16cid="http://schemas.microsoft.com/office/word/2016/wordml/cid" xmlns:w16="http://schemas.microsoft.com/office/word/2018/wordml" xmlns:w16du="http://schemas.microsoft.com/office/word/2023/wordml/word16du" xmlns:w16sdtdh="http://schemas.microsoft.com/office/word/2020/wordml/sdtdatahash" xmlns:w16sdtfl="http://schemas.microsoft.com/office/word/2024/wordml/sdtformatlock" xmlns:w16se="http://schemas.microsoft.com/office/word/2015/wordml/symex" xmlns:wpg="http://schemas.microsoft.com/office/word/2010/wordprocessingGroup" xmlns:wpi="http://schemas.microsoft.com/office/word/2010/wordprocessingInk" xmlns:wne="http://schemas.microsoft.com/office/word/2006/wordml" xmlns:wps="http://schemas.microsoft.com/office/word/2010/wordprocessingShape" mc:Ignorable="w14 w15 w16se w16cid w16 w16cex w16sdtdh w16sdtfl w16du wp14">
   <w:p>
     <w:pPr>
       <w:pStyle w:val="Header"/>
@@ -1582,7 +1570,7 @@
 </file>
 
 <file path=word/numbering.xml><?xml version="1.0" encoding="utf-8"?>
-<w:numbering xmlns:wpc="http://schemas.microsoft.com/office/word/2010/wordprocessingCanvas" xmlns:cx="http://schemas.microsoft.com/office/drawing/2014/chartex" xmlns:cx1="http://schemas.microsoft.com/office/drawing/2015/9/8/chartex" xmlns:cx2="http://schemas.microsoft.com/office/drawing/2015/10/21/chartex" xmlns:cx3="http://schemas.microsoft.com/office/drawing/2016/5/9/chartex" xmlns:cx4="http://schemas.microsoft.com/office/drawing/2016/5/10/chartex" xmlns:cx5="http://schemas.microsoft.com/office/drawing/2016/5/11/chartex" xmlns:cx6="http://schemas.microsoft.com/office/drawing/2016/5/12/chartex" xmlns:cx7="http://schemas.microsoft.com/office/drawing/2016/5/13/chartex" xmlns:cx8="http://schemas.microsoft.com/office/drawing/2016/5/14/chartex" xmlns:mc="http://schemas.openxmlformats.org/markup-compatibility/2006" xmlns:aink="http://schemas.microsoft.com/office/drawing/2016/ink" xmlns:am3d="http://schemas.microsoft.com/office/drawing/2017/model3d" xmlns:o="urn:schemas-microsoft-com:office:office" xmlns:r="http://schemas.openxmlformats.org/officeDocument/2006/relationships" xmlns:m="http://schemas.openxmlformats.org/officeDocument/2006/math" xmlns:v="urn:schemas-microsoft-com:vml" xmlns:wp14="http://schemas.microsoft.com/office/word/2010/wordprocessingDrawing" xmlns:wp="http://schemas.openxmlformats.org/drawingml/2006/wordprocessingDrawing" xmlns:w10="urn:schemas-microsoft-com:office:word" xmlns:w="http://schemas.openxmlformats.org/wordprocessingml/2006/main" xmlns:w14="http://schemas.microsoft.com/office/word/2010/wordml" xmlns:w15="http://schemas.microsoft.com/office/word/2012/wordml" xmlns:w16cex="http://schemas.microsoft.com/office/word/2018/wordml/cex" xmlns:w16cid="http://schemas.microsoft.com/office/word/2016/wordml/cid" xmlns:w16="http://schemas.microsoft.com/office/word/2018/wordml" xmlns:w16sdtdh="http://schemas.microsoft.com/office/word/2020/wordml/sdtdatahash" xmlns:w16se="http://schemas.microsoft.com/office/word/2015/wordml/symex" xmlns:wpg="http://schemas.microsoft.com/office/word/2010/wordprocessingGroup" xmlns:wpi="http://schemas.microsoft.com/office/word/2010/wordprocessingInk" xmlns:wne="http://schemas.microsoft.com/office/word/2006/wordml" xmlns:wps="http://schemas.microsoft.com/office/word/2010/wordprocessingShape" mc:Ignorable="w14 w15 w16se w16cid w16 w16cex w16sdtdh wp14">
+<w:numbering xmlns:wpc="http://schemas.microsoft.com/office/word/2010/wordprocessingCanvas" xmlns:cx="http://schemas.microsoft.com/office/drawing/2014/chartex" xmlns:cx1="http://schemas.microsoft.com/office/drawing/2015/9/8/chartex" xmlns:cx2="http://schemas.microsoft.com/office/drawing/2015/10/21/chartex" xmlns:cx3="http://schemas.microsoft.com/office/drawing/2016/5/9/chartex" xmlns:cx4="http://schemas.microsoft.com/office/drawing/2016/5/10/chartex" xmlns:cx5="http://schemas.microsoft.com/office/drawing/2016/5/11/chartex" xmlns:cx6="http://schemas.microsoft.com/office/drawing/2016/5/12/chartex" xmlns:cx7="http://schemas.microsoft.com/office/drawing/2016/5/13/chartex" xmlns:cx8="http://schemas.microsoft.com/office/drawing/2016/5/14/chartex" xmlns:mc="http://schemas.openxmlformats.org/markup-compatibility/2006" xmlns:aink="http://schemas.microsoft.com/office/drawing/2016/ink" xmlns:am3d="http://schemas.microsoft.com/office/drawing/2017/model3d" xmlns:o="urn:schemas-microsoft-com:office:office" xmlns:oel="http://schemas.microsoft.com/office/2019/extlst" xmlns:r="http://schemas.openxmlformats.org/officeDocument/2006/relationships" xmlns:m="http://schemas.openxmlformats.org/officeDocument/2006/math" xmlns:v="urn:schemas-microsoft-com:vml" xmlns:wp14="http://schemas.microsoft.com/office/word/2010/wordprocessingDrawing" xmlns:wp="http://schemas.openxmlformats.org/drawingml/2006/wordprocessingDrawing" xmlns:w10="urn:schemas-microsoft-com:office:word" xmlns:w="http://schemas.openxmlformats.org/wordprocessingml/2006/main" xmlns:w14="http://schemas.microsoft.com/office/word/2010/wordml" xmlns:w15="http://schemas.microsoft.com/office/word/2012/wordml" xmlns:w16cex="http://schemas.microsoft.com/office/word/2018/wordml/cex" xmlns:w16cid="http://schemas.microsoft.com/office/word/2016/wordml/cid" xmlns:w16="http://schemas.microsoft.com/office/word/2018/wordml" xmlns:w16du="http://schemas.microsoft.com/office/word/2023/wordml/word16du" xmlns:w16sdtdh="http://schemas.microsoft.com/office/word/2020/wordml/sdtdatahash" xmlns:w16sdtfl="http://schemas.microsoft.com/office/word/2024/wordml/sdtformatlock" xmlns:w16se="http://schemas.microsoft.com/office/word/2015/wordml/symex" xmlns:wpg="http://schemas.microsoft.com/office/word/2010/wordprocessingGroup" xmlns:wpi="http://schemas.microsoft.com/office/word/2010/wordprocessingInk" xmlns:wne="http://schemas.microsoft.com/office/word/2006/wordml" xmlns:wps="http://schemas.microsoft.com/office/word/2010/wordprocessingShape" mc:Ignorable="w14 w15 w16se w16cid w16 w16cex w16sdtdh w16sdtfl w16du wp14">
   <w:abstractNum w:abstractNumId="0" w15:restartNumberingAfterBreak="0">
     <w:nsid w:val="011D5CF4"/>
     <w:multiLevelType w:val="hybridMultilevel"/>
@@ -1922,20 +1910,20 @@
       </w:rPr>
     </w:lvl>
   </w:abstractNum>
-  <w:num w:numId="1">
+  <w:num w:numId="1" w16cid:durableId="1030953594">
     <w:abstractNumId w:val="0"/>
   </w:num>
-  <w:num w:numId="2">
+  <w:num w:numId="2" w16cid:durableId="1417556437">
     <w:abstractNumId w:val="2"/>
   </w:num>
-  <w:num w:numId="3">
+  <w:num w:numId="3" w16cid:durableId="1790926774">
     <w:abstractNumId w:val="1"/>
   </w:num>
 </w:numbering>
 </file>
 
 <file path=word/styles.xml><?xml version="1.0" encoding="utf-8"?>
-<w:styles xmlns:mc="http://schemas.openxmlformats.org/markup-compatibility/2006" xmlns:r="http://schemas.openxmlformats.org/officeDocument/2006/relationships" xmlns:w="http://schemas.openxmlformats.org/wordprocessingml/2006/main" xmlns:w14="http://schemas.microsoft.com/office/word/2010/wordml" xmlns:w15="http://schemas.microsoft.com/office/word/2012/wordml" xmlns:w16cex="http://schemas.microsoft.com/office/word/2018/wordml/cex" xmlns:w16cid="http://schemas.microsoft.com/office/word/2016/wordml/cid" xmlns:w16="http://schemas.microsoft.com/office/word/2018/wordml" xmlns:w16sdtdh="http://schemas.microsoft.com/office/word/2020/wordml/sdtdatahash" xmlns:w16se="http://schemas.microsoft.com/office/word/2015/wordml/symex" mc:Ignorable="w14 w15 w16se w16cid w16 w16cex w16sdtdh">
+<w:styles xmlns:mc="http://schemas.openxmlformats.org/markup-compatibility/2006" xmlns:r="http://schemas.openxmlformats.org/officeDocument/2006/relationships" xmlns:w="http://schemas.openxmlformats.org/wordprocessingml/2006/main" xmlns:w14="http://schemas.microsoft.com/office/word/2010/wordml" xmlns:w15="http://schemas.microsoft.com/office/word/2012/wordml" xmlns:w16cex="http://schemas.microsoft.com/office/word/2018/wordml/cex" xmlns:w16cid="http://schemas.microsoft.com/office/word/2016/wordml/cid" xmlns:w16="http://schemas.microsoft.com/office/word/2018/wordml" xmlns:w16du="http://schemas.microsoft.com/office/word/2023/wordml/word16du" xmlns:w16sdtdh="http://schemas.microsoft.com/office/word/2020/wordml/sdtdatahash" xmlns:w16sdtfl="http://schemas.microsoft.com/office/word/2024/wordml/sdtformatlock" xmlns:w16se="http://schemas.microsoft.com/office/word/2015/wordml/symex" mc:Ignorable="w14 w15 w16se w16cid w16 w16cex w16sdtdh w16sdtfl w16du">
   <w:docDefaults>
     <w:rPrDefault>
       <w:rPr>

</xml_diff>